<commit_message>
Update Word document with recent changes
</commit_message>
<xml_diff>
--- a/FundGrow_Improved_Report.docx
+++ b/FundGrow_Improved_Report.docx
@@ -622,269 +622,178 @@
           <w:docGrid w:linePitch="360" w:charSpace="0"/>
         </w:sectPr>
       </w:pPr>
+    </w:p>
+    <w:p>
+      <w:pPr>
+        <w:pStyle w:val="3"/>
+        <w:keepNext w:val="0"/>
+        <w:keepLines w:val="0"/>
+        <w:widowControl/>
+        <w:suppressLineNumbers w:val="0"/>
+      </w:pPr>
+      <w:r>
+        <w:t>Abstract</w:t>
+      </w:r>
       <w:bookmarkStart w:id="0" w:name="_GoBack"/>
       <w:bookmarkEnd w:id="0"/>
     </w:p>
     <w:p>
       <w:pPr>
-        <w:pStyle w:val="2"/>
-        <w:spacing w:before="300" w:after="200"/>
+        <w:pStyle w:val="15"/>
+        <w:keepNext w:val="0"/>
+        <w:keepLines w:val="0"/>
+        <w:widowControl/>
+        <w:suppressLineNumbers w:val="0"/>
       </w:pPr>
       <w:r>
-        <w:rPr>
-          <w:rFonts w:ascii="Arial" w:hAnsi="Arial" w:eastAsia="Arial" w:cs="Arial"/>
-          <w:b/>
-          <w:bCs/>
-          <w:color w:val="1F3864"/>
-          <w:sz w:val="36"/>
-          <w:szCs w:val="36"/>
-        </w:rPr>
-        <w:t>Abstract</w:t>
+        <w:t>Traditional funding mechanisms in Egypt, particularly bank loans, often impose strict eligibility requirements such as established credit history, collateral, and extensive documentation, creating significant barriers for early-stage startups seeking financial support. At the same time, individual investors face difficulties in identifying trustworthy, transparent, and well-managed investment opportunities. FundGrow addresses these challenges by providing a secure digital crowdfunding platform that connects entrepreneurs with investors through a centralized and transparent ecosystem.</w:t>
       </w:r>
     </w:p>
     <w:p>
       <w:pPr>
-        <w:spacing w:before="80" w:after="120" w:line="276" w:lineRule="auto"/>
-        <w:jc w:val="left"/>
+        <w:pStyle w:val="15"/>
+        <w:keepNext w:val="0"/>
+        <w:keepLines w:val="0"/>
+        <w:widowControl/>
+        <w:suppressLineNumbers w:val="0"/>
       </w:pPr>
       <w:r>
-        <w:rPr>
-          <w:rFonts w:ascii="Times New Roman" w:hAnsi="Times New Roman" w:eastAsia="Times New Roman" w:cs="Times New Roman"/>
-          <w:b w:val="0"/>
-          <w:bCs w:val="0"/>
-          <w:i w:val="0"/>
-          <w:iCs w:val="0"/>
-          <w:color w:val="000000"/>
-          <w:sz w:val="22"/>
-          <w:szCs w:val="22"/>
-        </w:rPr>
-        <w:t>Traditional funding mechanisms in Egypt — particularly bank loans — impose strict eligibility criteria including credit history, collateral, and extensive documentation, creating a significant barrier for early-stage startups. Simultaneously, individual investors lack reliable, regulated channels to discover and evaluate investment opportunities. FundGrow addresses both challenges by acting as a trusted digital intermediary between entrepreneurs and investors.</w:t>
+        <w:t>The platform supports three primary user roles: Startup Owners, who create and manage funding campaigns; Investors, who explore and invest in approved projects; and Administrators, who oversee platform operations through verification, approval, and system management processes. Core functionalities include secure authentication with role-based access control, project management, administrative approval workflows, configurable percentage-based investment contributions, automated platform fee calculation (5%), real-time funding progress monitoring, and comprehensive transaction history management.</w:t>
       </w:r>
     </w:p>
     <w:p>
       <w:pPr>
-        <w:spacing w:before="80" w:after="120" w:line="276" w:lineRule="auto"/>
-        <w:jc w:val="left"/>
+        <w:pStyle w:val="15"/>
+        <w:keepNext w:val="0"/>
+        <w:keepLines w:val="0"/>
+        <w:widowControl/>
+        <w:suppressLineNumbers w:val="0"/>
       </w:pPr>
       <w:r>
-        <w:rPr>
-          <w:rFonts w:ascii="Times New Roman" w:hAnsi="Times New Roman" w:eastAsia="Times New Roman" w:cs="Times New Roman"/>
-          <w:b w:val="0"/>
-          <w:bCs w:val="0"/>
-          <w:i w:val="0"/>
-          <w:iCs w:val="0"/>
-          <w:color w:val="000000"/>
-          <w:sz w:val="22"/>
-          <w:szCs w:val="22"/>
-        </w:rPr>
-        <w:t>The platform supports three user roles: startup owners who submit projects for funding, investors who browse and fund approved projects, and administrators who verify and manage the entire ecosystem. Core functionalities include user authentication with role-based access control, project creation and management, an administrative approval workflow, a mock investment system with configurable percentage-based contributions (subject to a 5% platform service fee), real-time funding progress tracking, and full transaction history.</w:t>
+        <w:t>The system was developed following a complete Software Development Life Cycle (SDLC), beginning with business analysis and requirements elicitation, followed by system modeling using UML diagrams, user interface design in Figma, implementation using Python (Flask), MySQL, Bootstrap 5, and Jinja2, and concluding with comprehensive software testing and quality assurance. A comprehensive suite of structured manual test cases covering all system modules was executed successfully, achieving a 100% pass rate and confirming that the implemented functionality satisfies all specified functional requirements.</w:t>
       </w:r>
     </w:p>
     <w:p>
       <w:pPr>
-        <w:spacing w:before="80" w:after="120" w:line="276" w:lineRule="auto"/>
-        <w:jc w:val="left"/>
+        <w:pStyle w:val="15"/>
+        <w:keepNext w:val="0"/>
+        <w:keepLines w:val="0"/>
+        <w:widowControl/>
+        <w:suppressLineNumbers w:val="0"/>
       </w:pPr>
       <w:r>
-        <w:rPr>
-          <w:rFonts w:ascii="Times New Roman" w:hAnsi="Times New Roman" w:eastAsia="Times New Roman" w:cs="Times New Roman"/>
-          <w:b w:val="0"/>
-          <w:bCs w:val="0"/>
-          <w:i w:val="0"/>
-          <w:iCs w:val="0"/>
-          <w:color w:val="000000"/>
-          <w:sz w:val="22"/>
-          <w:szCs w:val="22"/>
-        </w:rPr>
-        <w:t>The platform was designed following a complete software development lifecycle: business analysis, system requirements elicitation through pilot studies, UML-based system modeling, UI/UX wireframing in Figma, implementation using Python/Flask with MySQL, and comprehensive functional testing. A total of 93 structured test cases — organized across 16 modules — were executed, all of which passed successfully, confirming 100% functional compliance.</w:t>
+        <w:t>FundGrow contributes to Egypt's growing FinTech ecosystem by improving accessibility, transparency, and efficiency in startup financing while supporting the national vision for digital transformation and financial inclusion. Furthermore, the platform has been designed with scalability in mind, allowing future enhancements such as real payment gateway integration, AI-powered investment recommendations, mobile applications, advanced analytics, and enhanced security features.</w:t>
       </w:r>
     </w:p>
     <w:p>
       <w:pPr>
-        <w:spacing w:before="80" w:after="80" w:line="276" w:lineRule="auto"/>
-        <w:jc w:val="left"/>
+        <w:pStyle w:val="15"/>
+        <w:keepNext w:val="0"/>
+        <w:keepLines w:val="0"/>
+        <w:widowControl/>
+        <w:suppressLineNumbers w:val="0"/>
       </w:pPr>
       <w:r>
         <w:rPr>
-          <w:rFonts w:ascii="Times New Roman" w:hAnsi="Times New Roman" w:eastAsia="Times New Roman" w:cs="Times New Roman"/>
-          <w:b w:val="0"/>
-          <w:bCs w:val="0"/>
-          <w:i w:val="0"/>
-          <w:iCs w:val="0"/>
-          <w:color w:val="000000"/>
-          <w:sz w:val="22"/>
-          <w:szCs w:val="22"/>
+          <w:rStyle w:val="16"/>
         </w:rPr>
-        <w:t>FundGrow contributes to Egypt's FinTech ecosystem by making startup funding more accessible, transparent, and efficient. It aligns with the national goals of digital transformation and financial inclusion, offering a scalable foundation that can be extended with real payment integration, AI-based investment recommendations, and mobile applications in future iterations.</w:t>
+        <w:t>Keywords:</w:t>
+      </w:r>
+      <w:r>
+        <w:t xml:space="preserve"> Crowdfunding, FinTech, Startup Funding, Investment Platform, Egypt, Digital Transformation, Python Flask, MySQL, Bootstrap 5, Role-Based Access Control, Software Engineering.</w:t>
       </w:r>
     </w:p>
     <w:p>
       <w:pPr>
-        <w:spacing w:before="80" w:after="80" w:line="276" w:lineRule="auto"/>
-        <w:jc w:val="left"/>
+        <w:keepNext w:val="0"/>
+        <w:keepLines w:val="0"/>
+        <w:widowControl/>
+        <w:suppressLineNumbers w:val="0"/>
       </w:pPr>
       <w:r>
-        <w:rPr>
-          <w:rFonts w:ascii="Times New Roman" w:hAnsi="Times New Roman" w:eastAsia="Times New Roman" w:cs="Times New Roman"/>
-          <w:b w:val="0"/>
-          <w:bCs w:val="0"/>
-          <w:i/>
-          <w:iCs/>
-          <w:color w:val="555555"/>
-          <w:sz w:val="22"/>
-          <w:szCs w:val="22"/>
-        </w:rPr>
-        <w:t>Keywords: Crowdfunding, FinTech, Startup Funding, Investment Platform, Egypt, Digital Transformation, Flask, MySQL, Role-Based Access Control.</w:t>
+        <w:pict>
+          <v:rect id="_x0000_i1025" o:spt="1" style="height:1.5pt;width:432pt;" fillcolor="#A0A0A0" filled="t" stroked="f" coordsize="21600,21600" o:hr="t" o:hrstd="t" o:hralign="center">
+            <v:path/>
+            <v:fill on="t" focussize="0,0"/>
+            <v:stroke on="f"/>
+            <v:imagedata o:title=""/>
+            <o:lock v:ext="edit"/>
+            <w10:wrap type="none"/>
+            <w10:anchorlock/>
+          </v:rect>
+        </w:pict>
       </w:r>
     </w:p>
     <w:p>
       <w:pPr>
-        <w:pStyle w:val="2"/>
-        <w:spacing w:before="300" w:after="200"/>
+        <w:pStyle w:val="3"/>
+        <w:keepNext w:val="0"/>
+        <w:keepLines w:val="0"/>
+        <w:widowControl/>
+        <w:suppressLineNumbers w:val="0"/>
       </w:pPr>
       <w:r>
-        <w:rPr>
-          <w:rFonts w:ascii="Arial" w:hAnsi="Arial" w:eastAsia="Arial" w:cs="Arial"/>
-          <w:b/>
-          <w:bCs/>
-          <w:color w:val="1F3864"/>
-          <w:sz w:val="36"/>
-          <w:szCs w:val="36"/>
-        </w:rPr>
         <w:t>Acknowledgment</w:t>
       </w:r>
     </w:p>
     <w:p>
       <w:pPr>
-        <w:spacing w:before="80" w:after="80" w:line="276" w:lineRule="auto"/>
-        <w:jc w:val="left"/>
+        <w:pStyle w:val="15"/>
+        <w:keepNext w:val="0"/>
+        <w:keepLines w:val="0"/>
+        <w:widowControl/>
+        <w:suppressLineNumbers w:val="0"/>
       </w:pPr>
       <w:r>
-        <w:rPr>
-          <w:rFonts w:ascii="Times New Roman" w:hAnsi="Times New Roman" w:eastAsia="Times New Roman" w:cs="Times New Roman"/>
-          <w:b w:val="0"/>
-          <w:bCs w:val="0"/>
-          <w:i w:val="0"/>
-          <w:iCs w:val="0"/>
-          <w:color w:val="000000"/>
-          <w:sz w:val="22"/>
-          <w:szCs w:val="22"/>
-        </w:rPr>
-        <w:t>First and foremost, all praise and gratitude is given to Allah for granting the team the strength, knowledge, and perseverance to complete this graduation project. Without His guidance, this work would not have been possible.</w:t>
+        <w:t>First and foremost, we express our deepest gratitude to Allah Almighty for granting us the strength, patience, wisdom, and perseverance to successfully complete this project. Without His guidance and blessings, this achievement would not have been possible.</w:t>
       </w:r>
     </w:p>
     <w:p>
       <w:pPr>
-        <w:spacing w:before="80" w:after="80" w:line="276" w:lineRule="auto"/>
-        <w:jc w:val="left"/>
+        <w:pStyle w:val="15"/>
+        <w:keepNext w:val="0"/>
+        <w:keepLines w:val="0"/>
+        <w:widowControl/>
+        <w:suppressLineNumbers w:val="0"/>
       </w:pPr>
       <w:r>
-        <w:rPr>
-          <w:rFonts w:ascii="Times New Roman" w:hAnsi="Times New Roman" w:eastAsia="Times New Roman" w:cs="Times New Roman"/>
-          <w:b w:val="0"/>
-          <w:bCs w:val="0"/>
-          <w:i w:val="0"/>
-          <w:iCs w:val="0"/>
-          <w:color w:val="000000"/>
-          <w:sz w:val="22"/>
-          <w:szCs w:val="22"/>
-        </w:rPr>
-        <w:t>Sincere appreciation is extended to Helwan National University and the Faculty of Humanities, Commerce, and Business Administration for providing the academic environment, resources, and opportunities that shaped the educational journey throughout the Business Informatics &amp; Digital Transformation (BIDT) program.</w:t>
+        <w:t>We would like to express our sincere appreciation to everyone who contributed to the successful completion of this project through their knowledge, guidance, encouragement, and valuable support.</w:t>
       </w:r>
     </w:p>
     <w:p>
       <w:pPr>
-        <w:spacing w:before="80" w:after="80" w:line="276" w:lineRule="auto"/>
-        <w:jc w:val="left"/>
+        <w:pStyle w:val="15"/>
+        <w:keepNext w:val="0"/>
+        <w:keepLines w:val="0"/>
+        <w:widowControl/>
+        <w:suppressLineNumbers w:val="0"/>
       </w:pPr>
       <w:r>
-        <w:rPr>
-          <w:rFonts w:ascii="Times New Roman" w:hAnsi="Times New Roman" w:eastAsia="Times New Roman" w:cs="Times New Roman"/>
-          <w:b w:val="0"/>
-          <w:bCs w:val="0"/>
-          <w:i w:val="0"/>
-          <w:iCs w:val="0"/>
-          <w:color w:val="000000"/>
-          <w:sz w:val="22"/>
-          <w:szCs w:val="22"/>
-        </w:rPr>
-        <w:t>Deepest gratitude goes to Dr. Thanaa Mohamed (IT Supervisor) and Dr. Rasha Fargeli (Business Supervisor), whose expert guidance, constructive feedback, and continuous support were invaluable throughout every phase of this project.</w:t>
+        <w:t>We also extend our sincere gratitude to the entrepreneurs, investors, and industry professionals who participated in the pilot study and requirements elicitation process. Their practical insights and valuable feedback greatly contributed to designing a platform that addresses real-world challenges within Egypt's startup ecosystem.</w:t>
       </w:r>
     </w:p>
     <w:p>
       <w:pPr>
-        <w:spacing w:before="80" w:after="80" w:line="276" w:lineRule="auto"/>
-        <w:jc w:val="left"/>
+        <w:pStyle w:val="15"/>
+        <w:keepNext w:val="0"/>
+        <w:keepLines w:val="0"/>
+        <w:widowControl/>
+        <w:suppressLineNumbers w:val="0"/>
       </w:pPr>
       <w:r>
-        <w:rPr>
-          <w:rFonts w:ascii="Times New Roman" w:hAnsi="Times New Roman" w:eastAsia="Times New Roman" w:cs="Times New Roman"/>
-          <w:b w:val="0"/>
-          <w:bCs w:val="0"/>
-          <w:i w:val="0"/>
-          <w:iCs w:val="0"/>
-          <w:color w:val="000000"/>
-          <w:sz w:val="22"/>
-          <w:szCs w:val="22"/>
-        </w:rPr>
-        <w:t>Special thanks are extended to the professionals, entrepreneurs, and investors who participated in the pilot study and interviews during the requirements elicitation phase. Their real-world insights were critical in shaping a platform grounded in actual market needs.</w:t>
+        <w:t>We are deeply grateful to our families for their unwavering encouragement, patience, understanding, and continuous support throughout this journey. Their belief in us has been a constant source of motivation.</w:t>
       </w:r>
     </w:p>
     <w:p>
       <w:pPr>
-        <w:spacing w:before="80" w:after="80" w:line="276" w:lineRule="auto"/>
-        <w:jc w:val="left"/>
+        <w:pStyle w:val="15"/>
+        <w:keepNext w:val="0"/>
+        <w:keepLines w:val="0"/>
+        <w:widowControl/>
+        <w:suppressLineNumbers w:val="0"/>
       </w:pPr>
       <w:r>
-        <w:rPr>
-          <w:rFonts w:ascii="Times New Roman" w:hAnsi="Times New Roman" w:eastAsia="Times New Roman" w:cs="Times New Roman"/>
-          <w:b w:val="0"/>
-          <w:bCs w:val="0"/>
-          <w:i w:val="0"/>
-          <w:iCs w:val="0"/>
-          <w:color w:val="000000"/>
-          <w:sz w:val="22"/>
-          <w:szCs w:val="22"/>
-        </w:rPr>
-        <w:t>To the families of all team members — thank you for the unconditional love, endless patience, and unwavering support throughout this journey.</w:t>
-      </w:r>
-    </w:p>
-    <w:p>
-      <w:pPr>
-        <w:spacing w:before="80" w:after="80" w:line="276" w:lineRule="auto"/>
-        <w:jc w:val="left"/>
-      </w:pPr>
-      <w:r>
-        <w:rPr>
-          <w:rFonts w:ascii="Times New Roman" w:hAnsi="Times New Roman" w:eastAsia="Times New Roman" w:cs="Times New Roman"/>
-          <w:b w:val="0"/>
-          <w:bCs w:val="0"/>
-          <w:i w:val="0"/>
-          <w:iCs w:val="0"/>
-          <w:color w:val="000000"/>
-          <w:sz w:val="22"/>
-          <w:szCs w:val="22"/>
-        </w:rPr>
-        <w:t>This work is dedicated to every Egyptian entrepreneur who dreams of building something great but lacks the resources to begin. May FundGrow, in some small way, contribute to a future where opportunity is more equally accessible to all.</w:t>
-      </w:r>
-    </w:p>
-    <w:p>
-      <w:pPr>
-        <w:spacing w:before="80" w:after="80" w:line="276" w:lineRule="auto"/>
-        <w:jc w:val="left"/>
-      </w:pPr>
-      <w:r>
-        <w:rPr>
-          <w:rFonts w:ascii="Times New Roman" w:hAnsi="Times New Roman" w:eastAsia="Times New Roman" w:cs="Times New Roman"/>
-          <w:b w:val="0"/>
-          <w:bCs w:val="0"/>
-          <w:i/>
-          <w:iCs/>
-          <w:color w:val="555555"/>
-          <w:sz w:val="22"/>
-          <w:szCs w:val="22"/>
-        </w:rPr>
-        <w:t>— Belal Abouzaid, Mohamed Sherif, Abdelrahman Mohamed Abdo, Ahmed Alaa, Ahmed Saad | 2026</w:t>
+        <w:t>Finally, this project is dedicated to every aspiring entrepreneur striving to transform innovative ideas into successful ventures. We hope that FundGrow contributes to fostering entrepreneurship, encouraging innovation, promoting financial inclusion, and supporting the continued growth of the digital economy.</w:t>
       </w:r>
     </w:p>
     <w:p>
@@ -1064,7 +973,7 @@
     </w:p>
     <w:p>
       <w:pPr>
-        <w:pStyle w:val="16"/>
+        <w:pStyle w:val="18"/>
         <w:numPr>
           <w:ilvl w:val="0"/>
           <w:numId w:val="1"/>
@@ -1082,7 +991,7 @@
     </w:p>
     <w:p>
       <w:pPr>
-        <w:pStyle w:val="16"/>
+        <w:pStyle w:val="18"/>
         <w:numPr>
           <w:ilvl w:val="0"/>
           <w:numId w:val="1"/>
@@ -1100,7 +1009,7 @@
     </w:p>
     <w:p>
       <w:pPr>
-        <w:pStyle w:val="16"/>
+        <w:pStyle w:val="18"/>
         <w:numPr>
           <w:ilvl w:val="0"/>
           <w:numId w:val="1"/>
@@ -1173,7 +1082,7 @@
     </w:p>
     <w:p>
       <w:pPr>
-        <w:pStyle w:val="16"/>
+        <w:pStyle w:val="18"/>
         <w:numPr>
           <w:ilvl w:val="0"/>
           <w:numId w:val="2"/>
@@ -1191,7 +1100,7 @@
     </w:p>
     <w:p>
       <w:pPr>
-        <w:pStyle w:val="16"/>
+        <w:pStyle w:val="18"/>
         <w:numPr>
           <w:ilvl w:val="0"/>
           <w:numId w:val="2"/>
@@ -1209,7 +1118,7 @@
     </w:p>
     <w:p>
       <w:pPr>
-        <w:pStyle w:val="16"/>
+        <w:pStyle w:val="18"/>
         <w:numPr>
           <w:ilvl w:val="0"/>
           <w:numId w:val="2"/>
@@ -1227,7 +1136,7 @@
     </w:p>
     <w:p>
       <w:pPr>
-        <w:pStyle w:val="16"/>
+        <w:pStyle w:val="18"/>
         <w:numPr>
           <w:ilvl w:val="0"/>
           <w:numId w:val="2"/>
@@ -1245,7 +1154,7 @@
     </w:p>
     <w:p>
       <w:pPr>
-        <w:pStyle w:val="16"/>
+        <w:pStyle w:val="18"/>
         <w:numPr>
           <w:ilvl w:val="0"/>
           <w:numId w:val="2"/>
@@ -1263,7 +1172,7 @@
     </w:p>
     <w:p>
       <w:pPr>
-        <w:pStyle w:val="16"/>
+        <w:pStyle w:val="18"/>
         <w:numPr>
           <w:ilvl w:val="0"/>
           <w:numId w:val="2"/>
@@ -1336,7 +1245,7 @@
     </w:p>
     <w:p>
       <w:pPr>
-        <w:pStyle w:val="16"/>
+        <w:pStyle w:val="18"/>
         <w:numPr>
           <w:ilvl w:val="0"/>
           <w:numId w:val="1"/>
@@ -1354,7 +1263,7 @@
     </w:p>
     <w:p>
       <w:pPr>
-        <w:pStyle w:val="16"/>
+        <w:pStyle w:val="18"/>
         <w:numPr>
           <w:ilvl w:val="0"/>
           <w:numId w:val="1"/>
@@ -1372,7 +1281,7 @@
     </w:p>
     <w:p>
       <w:pPr>
-        <w:pStyle w:val="16"/>
+        <w:pStyle w:val="18"/>
         <w:numPr>
           <w:ilvl w:val="0"/>
           <w:numId w:val="1"/>
@@ -1390,7 +1299,7 @@
     </w:p>
     <w:p>
       <w:pPr>
-        <w:pStyle w:val="16"/>
+        <w:pStyle w:val="18"/>
         <w:numPr>
           <w:ilvl w:val="0"/>
           <w:numId w:val="1"/>
@@ -1408,7 +1317,7 @@
     </w:p>
     <w:p>
       <w:pPr>
-        <w:pStyle w:val="16"/>
+        <w:pStyle w:val="18"/>
         <w:numPr>
           <w:ilvl w:val="0"/>
           <w:numId w:val="1"/>
@@ -1426,7 +1335,7 @@
     </w:p>
     <w:p>
       <w:pPr>
-        <w:pStyle w:val="16"/>
+        <w:pStyle w:val="18"/>
         <w:numPr>
           <w:ilvl w:val="0"/>
           <w:numId w:val="1"/>
@@ -1444,7 +1353,7 @@
     </w:p>
     <w:p>
       <w:pPr>
-        <w:pStyle w:val="16"/>
+        <w:pStyle w:val="18"/>
         <w:numPr>
           <w:ilvl w:val="0"/>
           <w:numId w:val="1"/>
@@ -3438,7 +3347,7 @@
     </w:p>
     <w:p>
       <w:pPr>
-        <w:pStyle w:val="16"/>
+        <w:pStyle w:val="18"/>
         <w:numPr>
           <w:ilvl w:val="0"/>
           <w:numId w:val="2"/>
@@ -3456,7 +3365,7 @@
     </w:p>
     <w:p>
       <w:pPr>
-        <w:pStyle w:val="16"/>
+        <w:pStyle w:val="18"/>
         <w:numPr>
           <w:ilvl w:val="0"/>
           <w:numId w:val="2"/>
@@ -3474,7 +3383,7 @@
     </w:p>
     <w:p>
       <w:pPr>
-        <w:pStyle w:val="16"/>
+        <w:pStyle w:val="18"/>
         <w:numPr>
           <w:ilvl w:val="0"/>
           <w:numId w:val="2"/>
@@ -3492,7 +3401,7 @@
     </w:p>
     <w:p>
       <w:pPr>
-        <w:pStyle w:val="16"/>
+        <w:pStyle w:val="18"/>
         <w:numPr>
           <w:ilvl w:val="0"/>
           <w:numId w:val="2"/>
@@ -4370,7 +4279,7 @@
     </w:p>
     <w:p>
       <w:pPr>
-        <w:pStyle w:val="16"/>
+        <w:pStyle w:val="18"/>
         <w:numPr>
           <w:ilvl w:val="0"/>
           <w:numId w:val="1"/>
@@ -4388,7 +4297,7 @@
     </w:p>
     <w:p>
       <w:pPr>
-        <w:pStyle w:val="16"/>
+        <w:pStyle w:val="18"/>
         <w:numPr>
           <w:ilvl w:val="0"/>
           <w:numId w:val="1"/>
@@ -4406,7 +4315,7 @@
     </w:p>
     <w:p>
       <w:pPr>
-        <w:pStyle w:val="16"/>
+        <w:pStyle w:val="18"/>
         <w:numPr>
           <w:ilvl w:val="0"/>
           <w:numId w:val="1"/>
@@ -4424,7 +4333,7 @@
     </w:p>
     <w:p>
       <w:pPr>
-        <w:pStyle w:val="16"/>
+        <w:pStyle w:val="18"/>
         <w:numPr>
           <w:ilvl w:val="0"/>
           <w:numId w:val="1"/>
@@ -4442,7 +4351,7 @@
     </w:p>
     <w:p>
       <w:pPr>
-        <w:pStyle w:val="16"/>
+        <w:pStyle w:val="18"/>
         <w:numPr>
           <w:ilvl w:val="0"/>
           <w:numId w:val="1"/>
@@ -4532,7 +4441,7 @@
     </w:p>
     <w:p>
       <w:pPr>
-        <w:pStyle w:val="16"/>
+        <w:pStyle w:val="18"/>
         <w:numPr>
           <w:ilvl w:val="0"/>
           <w:numId w:val="1"/>
@@ -4550,7 +4459,7 @@
     </w:p>
     <w:p>
       <w:pPr>
-        <w:pStyle w:val="16"/>
+        <w:pStyle w:val="18"/>
         <w:numPr>
           <w:ilvl w:val="0"/>
           <w:numId w:val="1"/>
@@ -4568,7 +4477,7 @@
     </w:p>
     <w:p>
       <w:pPr>
-        <w:pStyle w:val="16"/>
+        <w:pStyle w:val="18"/>
         <w:numPr>
           <w:ilvl w:val="0"/>
           <w:numId w:val="1"/>
@@ -4586,7 +4495,7 @@
     </w:p>
     <w:p>
       <w:pPr>
-        <w:pStyle w:val="16"/>
+        <w:pStyle w:val="18"/>
         <w:numPr>
           <w:ilvl w:val="0"/>
           <w:numId w:val="1"/>
@@ -4604,7 +4513,7 @@
     </w:p>
     <w:p>
       <w:pPr>
-        <w:pStyle w:val="16"/>
+        <w:pStyle w:val="18"/>
         <w:numPr>
           <w:ilvl w:val="0"/>
           <w:numId w:val="1"/>
@@ -12817,7 +12726,7 @@
     </w:p>
     <w:p>
       <w:pPr>
-        <w:pStyle w:val="16"/>
+        <w:pStyle w:val="18"/>
         <w:numPr>
           <w:ilvl w:val="0"/>
           <w:numId w:val="1"/>
@@ -12835,7 +12744,7 @@
     </w:p>
     <w:p>
       <w:pPr>
-        <w:pStyle w:val="16"/>
+        <w:pStyle w:val="18"/>
         <w:numPr>
           <w:ilvl w:val="0"/>
           <w:numId w:val="1"/>
@@ -12853,7 +12762,7 @@
     </w:p>
     <w:p>
       <w:pPr>
-        <w:pStyle w:val="16"/>
+        <w:pStyle w:val="18"/>
         <w:numPr>
           <w:ilvl w:val="0"/>
           <w:numId w:val="1"/>
@@ -12871,7 +12780,7 @@
     </w:p>
     <w:p>
       <w:pPr>
-        <w:pStyle w:val="16"/>
+        <w:pStyle w:val="18"/>
         <w:numPr>
           <w:ilvl w:val="0"/>
           <w:numId w:val="1"/>
@@ -12889,7 +12798,7 @@
     </w:p>
     <w:p>
       <w:pPr>
-        <w:pStyle w:val="16"/>
+        <w:pStyle w:val="18"/>
         <w:numPr>
           <w:ilvl w:val="0"/>
           <w:numId w:val="1"/>
@@ -19954,7 +19863,7 @@
     </w:p>
     <w:p>
       <w:pPr>
-        <w:pStyle w:val="16"/>
+        <w:pStyle w:val="18"/>
         <w:numPr>
           <w:ilvl w:val="0"/>
           <w:numId w:val="1"/>
@@ -19972,7 +19881,7 @@
     </w:p>
     <w:p>
       <w:pPr>
-        <w:pStyle w:val="16"/>
+        <w:pStyle w:val="18"/>
         <w:numPr>
           <w:ilvl w:val="0"/>
           <w:numId w:val="1"/>
@@ -19990,7 +19899,7 @@
     </w:p>
     <w:p>
       <w:pPr>
-        <w:pStyle w:val="16"/>
+        <w:pStyle w:val="18"/>
         <w:numPr>
           <w:ilvl w:val="0"/>
           <w:numId w:val="1"/>
@@ -20090,7 +19999,7 @@
     </w:p>
     <w:p>
       <w:pPr>
-        <w:pStyle w:val="16"/>
+        <w:pStyle w:val="18"/>
         <w:numPr>
           <w:ilvl w:val="0"/>
           <w:numId w:val="1"/>
@@ -20108,7 +20017,7 @@
     </w:p>
     <w:p>
       <w:pPr>
-        <w:pStyle w:val="16"/>
+        <w:pStyle w:val="18"/>
         <w:numPr>
           <w:ilvl w:val="0"/>
           <w:numId w:val="1"/>
@@ -20126,7 +20035,7 @@
     </w:p>
     <w:p>
       <w:pPr>
-        <w:pStyle w:val="16"/>
+        <w:pStyle w:val="18"/>
         <w:numPr>
           <w:ilvl w:val="0"/>
           <w:numId w:val="1"/>
@@ -20582,7 +20491,7 @@
     </w:p>
     <w:p>
       <w:pPr>
-        <w:pStyle w:val="16"/>
+        <w:pStyle w:val="18"/>
         <w:numPr>
           <w:ilvl w:val="0"/>
           <w:numId w:val="1"/>
@@ -20600,7 +20509,7 @@
     </w:p>
     <w:p>
       <w:pPr>
-        <w:pStyle w:val="16"/>
+        <w:pStyle w:val="18"/>
         <w:numPr>
           <w:ilvl w:val="0"/>
           <w:numId w:val="1"/>
@@ -20618,7 +20527,7 @@
     </w:p>
     <w:p>
       <w:pPr>
-        <w:pStyle w:val="16"/>
+        <w:pStyle w:val="18"/>
         <w:numPr>
           <w:ilvl w:val="0"/>
           <w:numId w:val="1"/>
@@ -20636,7 +20545,7 @@
     </w:p>
     <w:p>
       <w:pPr>
-        <w:pStyle w:val="16"/>
+        <w:pStyle w:val="18"/>
         <w:numPr>
           <w:ilvl w:val="0"/>
           <w:numId w:val="1"/>
@@ -20654,7 +20563,7 @@
     </w:p>
     <w:p>
       <w:pPr>
-        <w:pStyle w:val="16"/>
+        <w:pStyle w:val="18"/>
         <w:numPr>
           <w:ilvl w:val="0"/>
           <w:numId w:val="1"/>
@@ -21387,7 +21296,7 @@
     </w:p>
     <w:p>
       <w:pPr>
-        <w:pStyle w:val="16"/>
+        <w:pStyle w:val="18"/>
         <w:numPr>
           <w:ilvl w:val="0"/>
           <w:numId w:val="1"/>
@@ -21405,7 +21314,7 @@
     </w:p>
     <w:p>
       <w:pPr>
-        <w:pStyle w:val="16"/>
+        <w:pStyle w:val="18"/>
         <w:numPr>
           <w:ilvl w:val="0"/>
           <w:numId w:val="1"/>
@@ -21423,7 +21332,7 @@
     </w:p>
     <w:p>
       <w:pPr>
-        <w:pStyle w:val="16"/>
+        <w:pStyle w:val="18"/>
         <w:numPr>
           <w:ilvl w:val="0"/>
           <w:numId w:val="1"/>
@@ -21511,6 +21420,12 @@
             <w:insideH w:val="single" w:color="auto" w:sz="4" w:space="0"/>
             <w:insideV w:val="single" w:color="auto" w:sz="4" w:space="0"/>
           </w:tblBorders>
+          <w:tblCellMar>
+            <w:top w:w="0" w:type="dxa"/>
+            <w:left w:w="10" w:type="dxa"/>
+            <w:bottom w:w="0" w:type="dxa"/>
+            <w:right w:w="10" w:type="dxa"/>
+          </w:tblCellMar>
         </w:tblPrEx>
         <w:trPr>
           <w:tblHeader/>
@@ -23437,7 +23352,7 @@
     </w:p>
     <w:p>
       <w:pPr>
-        <w:pStyle w:val="16"/>
+        <w:pStyle w:val="18"/>
         <w:numPr>
           <w:ilvl w:val="0"/>
           <w:numId w:val="1"/>
@@ -23455,7 +23370,7 @@
     </w:p>
     <w:p>
       <w:pPr>
-        <w:pStyle w:val="16"/>
+        <w:pStyle w:val="18"/>
         <w:numPr>
           <w:ilvl w:val="0"/>
           <w:numId w:val="1"/>
@@ -23473,7 +23388,7 @@
     </w:p>
     <w:p>
       <w:pPr>
-        <w:pStyle w:val="16"/>
+        <w:pStyle w:val="18"/>
         <w:numPr>
           <w:ilvl w:val="0"/>
           <w:numId w:val="1"/>
@@ -23491,7 +23406,7 @@
     </w:p>
     <w:p>
       <w:pPr>
-        <w:pStyle w:val="16"/>
+        <w:pStyle w:val="18"/>
         <w:numPr>
           <w:ilvl w:val="0"/>
           <w:numId w:val="1"/>
@@ -23509,7 +23424,7 @@
     </w:p>
     <w:p>
       <w:pPr>
-        <w:pStyle w:val="16"/>
+        <w:pStyle w:val="18"/>
         <w:numPr>
           <w:ilvl w:val="0"/>
           <w:numId w:val="1"/>
@@ -23527,7 +23442,7 @@
     </w:p>
     <w:p>
       <w:pPr>
-        <w:pStyle w:val="16"/>
+        <w:pStyle w:val="18"/>
         <w:numPr>
           <w:ilvl w:val="0"/>
           <w:numId w:val="1"/>
@@ -23545,7 +23460,7 @@
     </w:p>
     <w:p>
       <w:pPr>
-        <w:pStyle w:val="16"/>
+        <w:pStyle w:val="18"/>
         <w:numPr>
           <w:ilvl w:val="0"/>
           <w:numId w:val="1"/>
@@ -23563,7 +23478,7 @@
     </w:p>
     <w:p>
       <w:pPr>
-        <w:pStyle w:val="16"/>
+        <w:pStyle w:val="18"/>
         <w:numPr>
           <w:ilvl w:val="0"/>
           <w:numId w:val="1"/>
@@ -23581,7 +23496,7 @@
     </w:p>
     <w:p>
       <w:pPr>
-        <w:pStyle w:val="16"/>
+        <w:pStyle w:val="18"/>
         <w:numPr>
           <w:ilvl w:val="0"/>
           <w:numId w:val="1"/>
@@ -23599,7 +23514,7 @@
     </w:p>
     <w:p>
       <w:pPr>
-        <w:pStyle w:val="16"/>
+        <w:pStyle w:val="18"/>
         <w:numPr>
           <w:ilvl w:val="0"/>
           <w:numId w:val="1"/>
@@ -23617,7 +23532,7 @@
     </w:p>
     <w:p>
       <w:pPr>
-        <w:pStyle w:val="16"/>
+        <w:pStyle w:val="18"/>
         <w:numPr>
           <w:ilvl w:val="0"/>
           <w:numId w:val="1"/>
@@ -23635,7 +23550,7 @@
     </w:p>
     <w:p>
       <w:pPr>
-        <w:pStyle w:val="16"/>
+        <w:pStyle w:val="18"/>
         <w:numPr>
           <w:ilvl w:val="0"/>
           <w:numId w:val="1"/>
@@ -23653,7 +23568,7 @@
     </w:p>
     <w:p>
       <w:pPr>
-        <w:pStyle w:val="16"/>
+        <w:pStyle w:val="18"/>
         <w:numPr>
           <w:ilvl w:val="0"/>
           <w:numId w:val="1"/>
@@ -23705,7 +23620,7 @@
     </w:p>
     <w:p>
       <w:pPr>
-        <w:pStyle w:val="16"/>
+        <w:pStyle w:val="18"/>
         <w:numPr>
           <w:ilvl w:val="0"/>
           <w:numId w:val="1"/>
@@ -23723,7 +23638,7 @@
     </w:p>
     <w:p>
       <w:pPr>
-        <w:pStyle w:val="16"/>
+        <w:pStyle w:val="18"/>
         <w:numPr>
           <w:ilvl w:val="0"/>
           <w:numId w:val="1"/>
@@ -23741,7 +23656,7 @@
     </w:p>
     <w:p>
       <w:pPr>
-        <w:pStyle w:val="16"/>
+        <w:pStyle w:val="18"/>
         <w:numPr>
           <w:ilvl w:val="0"/>
           <w:numId w:val="1"/>
@@ -23759,7 +23674,7 @@
     </w:p>
     <w:p>
       <w:pPr>
-        <w:pStyle w:val="16"/>
+        <w:pStyle w:val="18"/>
         <w:numPr>
           <w:ilvl w:val="0"/>
           <w:numId w:val="1"/>
@@ -24780,7 +24695,7 @@
     </w:p>
     <w:p>
       <w:pPr>
-        <w:pStyle w:val="16"/>
+        <w:pStyle w:val="18"/>
         <w:numPr>
           <w:ilvl w:val="0"/>
           <w:numId w:val="1"/>
@@ -24798,7 +24713,7 @@
     </w:p>
     <w:p>
       <w:pPr>
-        <w:pStyle w:val="16"/>
+        <w:pStyle w:val="18"/>
         <w:numPr>
           <w:ilvl w:val="0"/>
           <w:numId w:val="1"/>
@@ -24816,7 +24731,7 @@
     </w:p>
     <w:p>
       <w:pPr>
-        <w:pStyle w:val="16"/>
+        <w:pStyle w:val="18"/>
         <w:numPr>
           <w:ilvl w:val="0"/>
           <w:numId w:val="1"/>
@@ -24834,7 +24749,7 @@
     </w:p>
     <w:p>
       <w:pPr>
-        <w:pStyle w:val="16"/>
+        <w:pStyle w:val="18"/>
         <w:numPr>
           <w:ilvl w:val="0"/>
           <w:numId w:val="1"/>
@@ -24852,7 +24767,7 @@
     </w:p>
     <w:p>
       <w:pPr>
-        <w:pStyle w:val="16"/>
+        <w:pStyle w:val="18"/>
         <w:numPr>
           <w:ilvl w:val="0"/>
           <w:numId w:val="1"/>
@@ -24870,7 +24785,7 @@
     </w:p>
     <w:p>
       <w:pPr>
-        <w:pStyle w:val="16"/>
+        <w:pStyle w:val="18"/>
         <w:numPr>
           <w:ilvl w:val="0"/>
           <w:numId w:val="1"/>
@@ -24888,7 +24803,7 @@
     </w:p>
     <w:p>
       <w:pPr>
-        <w:pStyle w:val="16"/>
+        <w:pStyle w:val="18"/>
         <w:numPr>
           <w:ilvl w:val="0"/>
           <w:numId w:val="1"/>
@@ -24906,7 +24821,7 @@
     </w:p>
     <w:p>
       <w:pPr>
-        <w:pStyle w:val="16"/>
+        <w:pStyle w:val="18"/>
         <w:numPr>
           <w:ilvl w:val="0"/>
           <w:numId w:val="1"/>
@@ -27026,7 +26941,7 @@
     </w:p>
     <w:p>
       <w:pPr>
-        <w:pStyle w:val="16"/>
+        <w:pStyle w:val="18"/>
         <w:numPr>
           <w:ilvl w:val="0"/>
           <w:numId w:val="1"/>
@@ -27044,7 +26959,7 @@
     </w:p>
     <w:p>
       <w:pPr>
-        <w:pStyle w:val="16"/>
+        <w:pStyle w:val="18"/>
         <w:numPr>
           <w:ilvl w:val="0"/>
           <w:numId w:val="1"/>
@@ -27062,7 +26977,7 @@
     </w:p>
     <w:p>
       <w:pPr>
-        <w:pStyle w:val="16"/>
+        <w:pStyle w:val="18"/>
         <w:numPr>
           <w:ilvl w:val="0"/>
           <w:numId w:val="1"/>
@@ -27080,7 +26995,7 @@
     </w:p>
     <w:p>
       <w:pPr>
-        <w:pStyle w:val="16"/>
+        <w:pStyle w:val="18"/>
         <w:numPr>
           <w:ilvl w:val="0"/>
           <w:numId w:val="1"/>
@@ -27098,7 +27013,7 @@
     </w:p>
     <w:p>
       <w:pPr>
-        <w:pStyle w:val="16"/>
+        <w:pStyle w:val="18"/>
         <w:numPr>
           <w:ilvl w:val="0"/>
           <w:numId w:val="1"/>
@@ -27116,7 +27031,7 @@
     </w:p>
     <w:p>
       <w:pPr>
-        <w:pStyle w:val="16"/>
+        <w:pStyle w:val="18"/>
         <w:numPr>
           <w:ilvl w:val="0"/>
           <w:numId w:val="1"/>
@@ -27134,7 +27049,7 @@
     </w:p>
     <w:p>
       <w:pPr>
-        <w:pStyle w:val="16"/>
+        <w:pStyle w:val="18"/>
         <w:numPr>
           <w:ilvl w:val="0"/>
           <w:numId w:val="1"/>
@@ -27152,7 +27067,7 @@
     </w:p>
     <w:p>
       <w:pPr>
-        <w:pStyle w:val="16"/>
+        <w:pStyle w:val="18"/>
         <w:numPr>
           <w:ilvl w:val="0"/>
           <w:numId w:val="1"/>
@@ -27170,7 +27085,7 @@
     </w:p>
     <w:p>
       <w:pPr>
-        <w:pStyle w:val="16"/>
+        <w:pStyle w:val="18"/>
         <w:numPr>
           <w:ilvl w:val="0"/>
           <w:numId w:val="1"/>
@@ -27188,7 +27103,7 @@
     </w:p>
     <w:p>
       <w:pPr>
-        <w:pStyle w:val="16"/>
+        <w:pStyle w:val="18"/>
         <w:numPr>
           <w:ilvl w:val="0"/>
           <w:numId w:val="1"/>
@@ -27206,7 +27121,7 @@
     </w:p>
     <w:p>
       <w:pPr>
-        <w:pStyle w:val="16"/>
+        <w:pStyle w:val="18"/>
         <w:numPr>
           <w:ilvl w:val="0"/>
           <w:numId w:val="1"/>
@@ -29572,7 +29487,7 @@
     </w:p>
     <w:p>
       <w:pPr>
-        <w:pStyle w:val="16"/>
+        <w:pStyle w:val="18"/>
         <w:numPr>
           <w:ilvl w:val="0"/>
           <w:numId w:val="1"/>
@@ -29590,7 +29505,7 @@
     </w:p>
     <w:p>
       <w:pPr>
-        <w:pStyle w:val="16"/>
+        <w:pStyle w:val="18"/>
         <w:numPr>
           <w:ilvl w:val="0"/>
           <w:numId w:val="1"/>
@@ -29608,7 +29523,7 @@
     </w:p>
     <w:p>
       <w:pPr>
-        <w:pStyle w:val="16"/>
+        <w:pStyle w:val="18"/>
         <w:numPr>
           <w:ilvl w:val="0"/>
           <w:numId w:val="1"/>
@@ -29626,7 +29541,7 @@
     </w:p>
     <w:p>
       <w:pPr>
-        <w:pStyle w:val="16"/>
+        <w:pStyle w:val="18"/>
         <w:numPr>
           <w:ilvl w:val="0"/>
           <w:numId w:val="1"/>
@@ -29644,7 +29559,7 @@
     </w:p>
     <w:p>
       <w:pPr>
-        <w:pStyle w:val="16"/>
+        <w:pStyle w:val="18"/>
         <w:numPr>
           <w:ilvl w:val="0"/>
           <w:numId w:val="1"/>
@@ -36330,7 +36245,7 @@
     </w:p>
     <w:p>
       <w:pPr>
-        <w:pStyle w:val="16"/>
+        <w:pStyle w:val="18"/>
         <w:numPr>
           <w:ilvl w:val="0"/>
           <w:numId w:val="1"/>
@@ -36348,7 +36263,7 @@
     </w:p>
     <w:p>
       <w:pPr>
-        <w:pStyle w:val="16"/>
+        <w:pStyle w:val="18"/>
         <w:numPr>
           <w:ilvl w:val="0"/>
           <w:numId w:val="1"/>
@@ -36366,7 +36281,7 @@
     </w:p>
     <w:p>
       <w:pPr>
-        <w:pStyle w:val="16"/>
+        <w:pStyle w:val="18"/>
         <w:numPr>
           <w:ilvl w:val="0"/>
           <w:numId w:val="1"/>
@@ -36384,7 +36299,7 @@
     </w:p>
     <w:p>
       <w:pPr>
-        <w:pStyle w:val="16"/>
+        <w:pStyle w:val="18"/>
         <w:numPr>
           <w:ilvl w:val="0"/>
           <w:numId w:val="1"/>
@@ -36402,7 +36317,7 @@
     </w:p>
     <w:p>
       <w:pPr>
-        <w:pStyle w:val="16"/>
+        <w:pStyle w:val="18"/>
         <w:numPr>
           <w:ilvl w:val="0"/>
           <w:numId w:val="1"/>
@@ -36614,7 +36529,7 @@
     </w:p>
     <w:p>
       <w:pPr>
-        <w:pStyle w:val="16"/>
+        <w:pStyle w:val="18"/>
         <w:numPr>
           <w:ilvl w:val="0"/>
           <w:numId w:val="2"/>
@@ -36632,7 +36547,7 @@
     </w:p>
     <w:p>
       <w:pPr>
-        <w:pStyle w:val="16"/>
+        <w:pStyle w:val="18"/>
         <w:numPr>
           <w:ilvl w:val="0"/>
           <w:numId w:val="2"/>
@@ -36650,7 +36565,7 @@
     </w:p>
     <w:p>
       <w:pPr>
-        <w:pStyle w:val="16"/>
+        <w:pStyle w:val="18"/>
         <w:numPr>
           <w:ilvl w:val="0"/>
           <w:numId w:val="2"/>
@@ -36668,7 +36583,7 @@
     </w:p>
     <w:p>
       <w:pPr>
-        <w:pStyle w:val="16"/>
+        <w:pStyle w:val="18"/>
         <w:numPr>
           <w:ilvl w:val="0"/>
           <w:numId w:val="2"/>
@@ -36686,7 +36601,7 @@
     </w:p>
     <w:p>
       <w:pPr>
-        <w:pStyle w:val="16"/>
+        <w:pStyle w:val="18"/>
         <w:numPr>
           <w:ilvl w:val="0"/>
           <w:numId w:val="2"/>
@@ -36704,7 +36619,7 @@
     </w:p>
     <w:p>
       <w:pPr>
-        <w:pStyle w:val="16"/>
+        <w:pStyle w:val="18"/>
         <w:numPr>
           <w:ilvl w:val="0"/>
           <w:numId w:val="2"/>
@@ -36722,7 +36637,7 @@
     </w:p>
     <w:p>
       <w:pPr>
-        <w:pStyle w:val="16"/>
+        <w:pStyle w:val="18"/>
         <w:numPr>
           <w:ilvl w:val="0"/>
           <w:numId w:val="2"/>
@@ -36740,7 +36655,7 @@
     </w:p>
     <w:p>
       <w:pPr>
-        <w:pStyle w:val="16"/>
+        <w:pStyle w:val="18"/>
         <w:numPr>
           <w:ilvl w:val="0"/>
           <w:numId w:val="2"/>
@@ -39671,7 +39586,7 @@
   <w:docDefaults>
     <w:rPrDefault>
       <w:rPr>
-        <w:rFonts w:ascii="Times New Roman" w:hAnsi="Times New Roman" w:eastAsia="Times New Roman" w:cs="Times New Roman"/>
+        <w:rFonts w:ascii="Times New Roman" w:hAnsi="Times New Roman" w:eastAsia="SimSun" w:cs="Times New Roman"/>
       </w:rPr>
     </w:rPrDefault>
     <w:pPrDefault/>
@@ -40059,7 +39974,7 @@
   </w:style>
   <w:style w:type="paragraph" w:styleId="11">
     <w:name w:val="endnote text"/>
-    <w:link w:val="18"/>
+    <w:link w:val="20"/>
     <w:semiHidden/>
     <w:unhideWhenUsed/>
     <w:uiPriority w:val="99"/>
@@ -40084,7 +39999,7 @@
   </w:style>
   <w:style w:type="paragraph" w:styleId="13">
     <w:name w:val="footnote text"/>
-    <w:link w:val="17"/>
+    <w:link w:val="19"/>
     <w:semiHidden/>
     <w:unhideWhenUsed/>
     <w:qFormat/>
@@ -40109,6 +40024,31 @@
     </w:rPr>
   </w:style>
   <w:style w:type="paragraph" w:styleId="15">
+    <w:name w:val="Normal (Web)"/>
+    <w:uiPriority w:val="0"/>
+    <w:pPr>
+      <w:spacing w:before="0" w:beforeAutospacing="1" w:after="0" w:afterAutospacing="1"/>
+      <w:ind w:left="0" w:right="0"/>
+      <w:jc w:val="left"/>
+    </w:pPr>
+    <w:rPr>
+      <w:kern w:val="0"/>
+      <w:sz w:val="24"/>
+      <w:szCs w:val="24"/>
+      <w:lang w:val="en-US" w:eastAsia="zh-CN" w:bidi="ar"/>
+    </w:rPr>
+  </w:style>
+  <w:style w:type="character" w:styleId="16">
+    <w:name w:val="Strong"/>
+    <w:basedOn w:val="8"/>
+    <w:qFormat/>
+    <w:uiPriority w:val="0"/>
+    <w:rPr>
+      <w:b/>
+      <w:bCs/>
+    </w:rPr>
+  </w:style>
+  <w:style w:type="paragraph" w:styleId="17">
     <w:name w:val="Title"/>
     <w:qFormat/>
     <w:uiPriority w:val="0"/>
@@ -40118,7 +40058,7 @@
       <w:szCs w:val="56"/>
     </w:rPr>
   </w:style>
-  <w:style w:type="paragraph" w:styleId="16">
+  <w:style w:type="paragraph" w:styleId="18">
     <w:name w:val="List Paragraph"/>
     <w:qFormat/>
     <w:uiPriority w:val="0"/>
@@ -40128,7 +40068,7 @@
       <w:szCs w:val="22"/>
     </w:rPr>
   </w:style>
-  <w:style w:type="character" w:customStyle="1" w:styleId="17">
+  <w:style w:type="character" w:customStyle="1" w:styleId="19">
     <w:name w:val="Footnote Text Char"/>
     <w:link w:val="13"/>
     <w:semiHidden/>
@@ -40140,7 +40080,7 @@
       <w:szCs w:val="20"/>
     </w:rPr>
   </w:style>
-  <w:style w:type="character" w:customStyle="1" w:styleId="18">
+  <w:style w:type="character" w:customStyle="1" w:styleId="20">
     <w:name w:val="Endnote Text Char"/>
     <w:link w:val="11"/>
     <w:semiHidden/>

</xml_diff>